<commit_message>
Meeting log 1/22/16 added as well as final project description updated. Ready to submit
</commit_message>
<xml_diff>
--- a/Meeting Logs/Meeting Log 1-19-26 through 1-25-26.docx
+++ b/Meeting Logs/Meeting Log 1-19-26 through 1-25-26.docx
@@ -53,21 +53,19 @@
               </w:rPr>
               <w:t xml:space="preserve">Find </w:t>
             </w:r>
-            <w:proofErr w:type="gramStart"/>
-            <w:r>
-              <w:rPr>
-                <w:sz w:val="22"/>
-                <w:szCs w:val="22"/>
-              </w:rPr>
-              <w:t>A</w:t>
-            </w:r>
-            <w:proofErr w:type="gramEnd"/>
-            <w:r>
-              <w:rPr>
-                <w:sz w:val="22"/>
-                <w:szCs w:val="22"/>
-              </w:rPr>
-              <w:t xml:space="preserve"> Pump</w:t>
+            <w:r>
+              <w:rPr>
+                <w:sz w:val="22"/>
+                <w:szCs w:val="22"/>
+              </w:rPr>
+              <w:t xml:space="preserve">A </w:t>
+            </w:r>
+            <w:r>
+              <w:rPr>
+                <w:sz w:val="22"/>
+                <w:szCs w:val="22"/>
+              </w:rPr>
+              <w:t>Pump</w:t>
             </w:r>
           </w:p>
         </w:tc>
@@ -634,6 +632,13 @@
                 <w:szCs w:val="22"/>
               </w:rPr>
             </w:pPr>
+            <w:r>
+              <w:rPr>
+                <w:sz w:val="22"/>
+                <w:szCs w:val="22"/>
+              </w:rPr>
+              <w:t>1/22/26</w:t>
+            </w:r>
           </w:p>
         </w:tc>
         <w:tc>
@@ -647,6 +652,13 @@
                 <w:szCs w:val="22"/>
               </w:rPr>
             </w:pPr>
+            <w:r>
+              <w:rPr>
+                <w:sz w:val="22"/>
+                <w:szCs w:val="22"/>
+              </w:rPr>
+              <w:t>7:00</w:t>
+            </w:r>
           </w:p>
         </w:tc>
         <w:tc>
@@ -660,6 +672,13 @@
                 <w:szCs w:val="22"/>
               </w:rPr>
             </w:pPr>
+            <w:r>
+              <w:rPr>
+                <w:sz w:val="22"/>
+                <w:szCs w:val="22"/>
+              </w:rPr>
+              <w:t>All</w:t>
+            </w:r>
           </w:p>
         </w:tc>
       </w:tr>
@@ -858,6 +877,13 @@
         </w:rPr>
         <w:t>:</w:t>
       </w:r>
+      <w:r>
+        <w:rPr>
+          <w:sz w:val="22"/>
+          <w:szCs w:val="22"/>
+        </w:rPr>
+        <w:t xml:space="preserve"> Added Visuals as well as some other paragraphs to the Final project Description</w:t>
+      </w:r>
     </w:p>
     <w:p>
       <w:pPr>
@@ -945,14 +971,7 @@
           <w:sz w:val="22"/>
           <w:szCs w:val="22"/>
         </w:rPr>
-        <w:t>:</w:t>
-      </w:r>
-      <w:r>
-        <w:rPr>
-          <w:sz w:val="22"/>
-          <w:szCs w:val="22"/>
-        </w:rPr>
-        <w:t xml:space="preserve"> We are having a hard time looking for free APIs that allow us to get the data for the gas prices within Utah county.</w:t>
+        <w:t>: We are having a hard time looking for free APIs that allow us to get the data for the gas prices within Utah county.</w:t>
       </w:r>
     </w:p>
     <w:p>
@@ -976,14 +995,7 @@
           <w:sz w:val="22"/>
           <w:szCs w:val="22"/>
         </w:rPr>
-        <w:t>:</w:t>
-      </w:r>
-      <w:r>
-        <w:rPr>
-          <w:sz w:val="22"/>
-          <w:szCs w:val="22"/>
-        </w:rPr>
-        <w:t xml:space="preserve"> With the final project we suggest </w:t>
+        <w:t xml:space="preserve">: With the final project we suggest </w:t>
       </w:r>
       <w:r>
         <w:rPr>
@@ -1024,6 +1036,20 @@
         </w:rPr>
         <w:t>:</w:t>
       </w:r>
+      <w:r>
+        <w:rPr>
+          <w:sz w:val="22"/>
+          <w:szCs w:val="22"/>
+        </w:rPr>
+        <w:t xml:space="preserve"> </w:t>
+      </w:r>
+      <w:r>
+        <w:rPr>
+          <w:sz w:val="22"/>
+          <w:szCs w:val="22"/>
+        </w:rPr>
+        <w:t>For this portion no obstacles to be reported</w:t>
+      </w:r>
     </w:p>
     <w:p>
       <w:pPr>
@@ -1111,14 +1137,7 @@
           <w:sz w:val="22"/>
           <w:szCs w:val="22"/>
         </w:rPr>
-        <w:t>:</w:t>
-      </w:r>
-      <w:r>
-        <w:rPr>
-          <w:sz w:val="22"/>
-          <w:szCs w:val="22"/>
-        </w:rPr>
-        <w:t xml:space="preserve"> We Plan on finalizing our paragraphs for the final project description as well as grammar check and revise the paragraphs. </w:t>
+        <w:t xml:space="preserve">: We Plan on finalizing our paragraphs for the final project description as well as grammar check and revise the paragraphs. </w:t>
       </w:r>
       <w:r>
         <w:rPr>
@@ -1144,7 +1163,6 @@
         </w:rPr>
         <w:t xml:space="preserve">Meeting </w:t>
       </w:r>
-      <w:proofErr w:type="gramStart"/>
       <w:r>
         <w:rPr>
           <w:sz w:val="22"/>
@@ -1164,9 +1182,8 @@
           <w:sz w:val="22"/>
           <w:szCs w:val="22"/>
         </w:rPr>
-        <w:t>We</w:t>
-      </w:r>
-      <w:proofErr w:type="gramEnd"/>
+        <w:t xml:space="preserve"> We</w:t>
+      </w:r>
       <w:r>
         <w:rPr>
           <w:sz w:val="22"/>
@@ -1198,6 +1215,13 @@
         </w:rPr>
         <w:t>:</w:t>
       </w:r>
+      <w:r>
+        <w:rPr>
+          <w:sz w:val="22"/>
+          <w:szCs w:val="22"/>
+        </w:rPr>
+        <w:t xml:space="preserve"> Have an insight into what the SRS is going to look like and have some of it done</w:t>
+      </w:r>
     </w:p>
     <w:p>
       <w:pPr>
@@ -1288,14 +1312,7 @@
           <w:sz w:val="22"/>
           <w:szCs w:val="22"/>
         </w:rPr>
-        <w:t>:</w:t>
-      </w:r>
-      <w:r>
-        <w:rPr>
-          <w:sz w:val="22"/>
-          <w:szCs w:val="22"/>
-        </w:rPr>
-        <w:t xml:space="preserve"> Do more API research since that would be the most time consuming and look at how to connect then accurately with JavaScript</w:t>
+        <w:t>: Do more API research since that would be the most time consuming and look at how to connect then accurately with JavaScript</w:t>
       </w:r>
     </w:p>
     <w:p>
@@ -1319,63 +1336,25 @@
           <w:sz w:val="22"/>
           <w:szCs w:val="22"/>
         </w:rPr>
-        <w:t>:</w:t>
-      </w:r>
-      <w:r>
-        <w:rPr>
-          <w:sz w:val="22"/>
-          <w:szCs w:val="22"/>
-        </w:rPr>
-        <w:t xml:space="preserve"> Put together the project description and make sure that everything is professional and does not look bland. </w:t>
-      </w:r>
-    </w:p>
-    <w:p>
-      <w:pPr>
-        <w:rPr>
-          <w:sz w:val="22"/>
-          <w:szCs w:val="22"/>
-        </w:rPr>
-      </w:pPr>
-      <w:r>
-        <w:rPr>
-          <w:sz w:val="22"/>
-          <w:szCs w:val="22"/>
-        </w:rPr>
-        <w:t>Meeting 3:</w:t>
-      </w:r>
-    </w:p>
-    <w:p>
-      <w:pPr>
-        <w:rPr>
-          <w:sz w:val="22"/>
-          <w:szCs w:val="22"/>
-        </w:rPr>
-      </w:pPr>
-      <w:r>
-        <w:rPr>
-          <w:sz w:val="22"/>
-          <w:szCs w:val="22"/>
-        </w:rPr>
-        <w:t>Meeting 4:</w:t>
-      </w:r>
-    </w:p>
-    <w:p>
-      <w:pPr>
-        <w:rPr>
-          <w:sz w:val="22"/>
-          <w:szCs w:val="22"/>
-        </w:rPr>
-      </w:pPr>
-    </w:p>
-    <w:p>
-      <w:pPr>
+        <w:t xml:space="preserve">: Put together the project description and make sure that everything is professional and does not look bland. </w:t>
+      </w:r>
+    </w:p>
+    <w:p>
+      <w:pPr>
+        <w:rPr>
+          <w:sz w:val="22"/>
+          <w:szCs w:val="22"/>
+        </w:rPr>
+      </w:pPr>
+      <w:r>
         <w:rPr>
           <w:b/>
           <w:bCs/>
           <w:sz w:val="22"/>
           <w:szCs w:val="22"/>
         </w:rPr>
-      </w:pPr>
+        <w:t xml:space="preserve">Meeting </w:t>
+      </w:r>
       <w:r>
         <w:rPr>
           <w:b/>
@@ -1383,8 +1362,67 @@
           <w:sz w:val="22"/>
           <w:szCs w:val="22"/>
         </w:rPr>
-        <w:t>Action Items &amp; Ownership</w:t>
-      </w:r>
+        <w:t>3</w:t>
+      </w:r>
+      <w:r>
+        <w:rPr>
+          <w:sz w:val="22"/>
+          <w:szCs w:val="22"/>
+        </w:rPr>
+        <w:t>: Non-Functional (what it should do not what it does)</w:t>
+      </w:r>
+    </w:p>
+    <w:p>
+      <w:pPr>
+        <w:rPr>
+          <w:sz w:val="22"/>
+          <w:szCs w:val="22"/>
+        </w:rPr>
+      </w:pPr>
+      <w:r>
+        <w:rPr>
+          <w:sz w:val="22"/>
+          <w:szCs w:val="22"/>
+        </w:rPr>
+        <w:t xml:space="preserve">Functional (what it does) </w:t>
+      </w:r>
+      <w:r>
+        <w:rPr>
+          <w:sz w:val="22"/>
+          <w:szCs w:val="22"/>
+        </w:rPr>
+        <w:t>Looked at the description for the SRS and what is required</w:t>
+      </w:r>
+    </w:p>
+    <w:p>
+      <w:pPr>
+        <w:rPr>
+          <w:sz w:val="22"/>
+          <w:szCs w:val="22"/>
+        </w:rPr>
+      </w:pPr>
+      <w:r>
+        <w:rPr>
+          <w:sz w:val="22"/>
+          <w:szCs w:val="22"/>
+        </w:rPr>
+        <w:t>Meeting 4:</w:t>
+      </w:r>
+      <w:r>
+        <w:rPr>
+          <w:sz w:val="22"/>
+          <w:szCs w:val="22"/>
+        </w:rPr>
+        <w:t xml:space="preserve"> </w:t>
+      </w:r>
+    </w:p>
+    <w:p>
+      <w:pPr>
+        <w:rPr>
+          <w:sz w:val="22"/>
+          <w:szCs w:val="22"/>
+        </w:rPr>
+      </w:pPr>
     </w:p>
     <w:p>
       <w:pPr>
@@ -1402,64 +1440,7 @@
           <w:sz w:val="22"/>
           <w:szCs w:val="22"/>
         </w:rPr>
-        <w:t>Kyler</w:t>
-      </w:r>
-    </w:p>
-    <w:p>
-      <w:pPr>
-        <w:rPr>
-          <w:b/>
-          <w:bCs/>
-          <w:sz w:val="22"/>
-          <w:szCs w:val="22"/>
-        </w:rPr>
-      </w:pPr>
-      <w:r>
-        <w:rPr>
-          <w:b/>
-          <w:bCs/>
-          <w:sz w:val="22"/>
-          <w:szCs w:val="22"/>
-        </w:rPr>
-        <w:t>Nathan</w:t>
-      </w:r>
-    </w:p>
-    <w:p>
-      <w:pPr>
-        <w:rPr>
-          <w:b/>
-          <w:bCs/>
-          <w:sz w:val="22"/>
-          <w:szCs w:val="22"/>
-        </w:rPr>
-      </w:pPr>
-      <w:r>
-        <w:rPr>
-          <w:b/>
-          <w:bCs/>
-          <w:sz w:val="22"/>
-          <w:szCs w:val="22"/>
-        </w:rPr>
-        <w:t>Thomas</w:t>
-      </w:r>
-    </w:p>
-    <w:p>
-      <w:pPr>
-        <w:rPr>
-          <w:b/>
-          <w:bCs/>
-          <w:sz w:val="22"/>
-          <w:szCs w:val="22"/>
-        </w:rPr>
-      </w:pPr>
-      <w:r>
-        <w:rPr>
-          <w:b/>
-          <w:bCs/>
-          <w:sz w:val="22"/>
-          <w:szCs w:val="22"/>
-        </w:rPr>
-        <w:t>Eric</w:t>
+        <w:t>Action Items &amp; Ownership</w:t>
       </w:r>
     </w:p>
     <w:p>
@@ -1504,9 +1485,9 @@
         <w:tblLook w:val="04A0" w:firstRow="1" w:lastRow="0" w:firstColumn="1" w:lastColumn="0" w:noHBand="0" w:noVBand="1"/>
       </w:tblPr>
       <w:tblGrid>
-        <w:gridCol w:w="1228"/>
+        <w:gridCol w:w="4667"/>
         <w:gridCol w:w="1237"/>
-        <w:gridCol w:w="1000"/>
+        <w:gridCol w:w="1700"/>
       </w:tblGrid>
       <w:tr>
         <w:trPr>
@@ -1592,6 +1573,133 @@
           </w:p>
         </w:tc>
       </w:tr>
+      <w:tr>
+        <w:trPr>
+          <w:tblHeader/>
+          <w:tblCellSpacing w:w="15" w:type="dxa"/>
+        </w:trPr>
+        <w:tc>
+          <w:tcPr>
+            <w:tcW w:w="0" w:type="auto"/>
+            <w:vAlign w:val="center"/>
+          </w:tcPr>
+          <w:p>
+            <w:pPr>
+              <w:rPr>
+                <w:b/>
+                <w:bCs/>
+                <w:sz w:val="22"/>
+                <w:szCs w:val="22"/>
+              </w:rPr>
+            </w:pPr>
+            <w:r>
+              <w:rPr>
+                <w:b/>
+                <w:bCs/>
+                <w:sz w:val="22"/>
+                <w:szCs w:val="22"/>
+              </w:rPr>
+              <w:t>Functional Requirements (Kyler, Nathan)</w:t>
+            </w:r>
+          </w:p>
+          <w:p>
+            <w:pPr>
+              <w:rPr>
+                <w:b/>
+                <w:bCs/>
+                <w:sz w:val="22"/>
+                <w:szCs w:val="22"/>
+              </w:rPr>
+            </w:pPr>
+            <w:r>
+              <w:rPr>
+                <w:b/>
+                <w:bCs/>
+                <w:sz w:val="22"/>
+                <w:szCs w:val="22"/>
+              </w:rPr>
+              <w:t xml:space="preserve">NON- </w:t>
+            </w:r>
+            <w:r>
+              <w:rPr>
+                <w:b/>
+                <w:bCs/>
+                <w:sz w:val="22"/>
+                <w:szCs w:val="22"/>
+              </w:rPr>
+              <w:t>Functional Requirements</w:t>
+            </w:r>
+            <w:r>
+              <w:rPr>
+                <w:b/>
+                <w:bCs/>
+                <w:sz w:val="22"/>
+                <w:szCs w:val="22"/>
+              </w:rPr>
+              <w:t xml:space="preserve"> (Eric, Thomas</w:t>
+            </w:r>
+            <w:r>
+              <w:rPr>
+                <w:b/>
+                <w:bCs/>
+                <w:sz w:val="22"/>
+                <w:szCs w:val="22"/>
+              </w:rPr>
+              <w:t>)</w:t>
+            </w:r>
+          </w:p>
+        </w:tc>
+        <w:tc>
+          <w:tcPr>
+            <w:tcW w:w="0" w:type="auto"/>
+            <w:vAlign w:val="center"/>
+          </w:tcPr>
+          <w:p>
+            <w:pPr>
+              <w:rPr>
+                <w:b/>
+                <w:bCs/>
+                <w:sz w:val="22"/>
+                <w:szCs w:val="22"/>
+              </w:rPr>
+            </w:pPr>
+          </w:p>
+        </w:tc>
+        <w:tc>
+          <w:tcPr>
+            <w:tcW w:w="0" w:type="auto"/>
+            <w:vAlign w:val="center"/>
+          </w:tcPr>
+          <w:p>
+            <w:pPr>
+              <w:rPr>
+                <w:b/>
+                <w:bCs/>
+                <w:sz w:val="22"/>
+                <w:szCs w:val="22"/>
+              </w:rPr>
+            </w:pPr>
+            <w:r>
+              <w:rPr>
+                <w:b/>
+                <w:bCs/>
+                <w:sz w:val="22"/>
+                <w:szCs w:val="22"/>
+              </w:rPr>
+              <w:t>Tuesday 1/</w:t>
+            </w:r>
+            <w:r>
+              <w:rPr>
+                <w:b/>
+                <w:bCs/>
+                <w:sz w:val="22"/>
+                <w:szCs w:val="22"/>
+              </w:rPr>
+              <w:t>27/26</w:t>
+            </w:r>
+          </w:p>
+        </w:tc>
+      </w:tr>
     </w:tbl>
     <w:p>
       <w:pPr>
@@ -1619,6 +1727,7 @@
           <w:sz w:val="22"/>
           <w:szCs w:val="22"/>
         </w:rPr>
+        <w:lastRenderedPageBreak/>
         <w:t>Next Meeting</w:t>
       </w:r>
     </w:p>

</xml_diff>

<commit_message>
meeting log update for week of 1-19-26 through 1-25-26
</commit_message>
<xml_diff>
--- a/Meeting Logs/Meeting Log 1-19-26 through 1-25-26.docx
+++ b/Meeting Logs/Meeting Log 1-19-26 through 1-25-26.docx
@@ -1212,7 +1212,23 @@
           <w:sz w:val="22"/>
           <w:szCs w:val="22"/>
         </w:rPr>
-        <w:t xml:space="preserve"> Don’t know the extent of the SRS that we need to complete a template would be </w:t>
+        <w:t xml:space="preserve"> </w:t>
+      </w:r>
+      <w:proofErr w:type="gramStart"/>
+      <w:r>
+        <w:rPr>
+          <w:sz w:val="22"/>
+          <w:szCs w:val="22"/>
+        </w:rPr>
+        <w:t>Don’t</w:t>
+      </w:r>
+      <w:proofErr w:type="gramEnd"/>
+      <w:r>
+        <w:rPr>
+          <w:sz w:val="22"/>
+          <w:szCs w:val="22"/>
+        </w:rPr>
+        <w:t xml:space="preserve"> know the extent of the SRS that we need to complete a template would be </w:t>
       </w:r>
       <w:r>
         <w:rPr>
@@ -1651,21 +1667,44 @@
           <w:sz w:val="22"/>
           <w:szCs w:val="22"/>
         </w:rPr>
-        <w:t>Meeting 4:</w:t>
-      </w:r>
-      <w:r>
-        <w:rPr>
-          <w:sz w:val="22"/>
-          <w:szCs w:val="22"/>
-        </w:rPr>
-        <w:t xml:space="preserve"> </w:t>
-      </w:r>
-      <w:r>
-        <w:rPr>
-          <w:sz w:val="22"/>
-          <w:szCs w:val="22"/>
-        </w:rPr>
-        <w:t xml:space="preserve"> Ask about how much we need to have a complete SRS</w:t>
+        <w:t>Meeting 4</w:t>
+      </w:r>
+      <w:r>
+        <w:rPr>
+          <w:sz w:val="22"/>
+          <w:szCs w:val="22"/>
+        </w:rPr>
+        <w:t>: Ask</w:t>
+      </w:r>
+      <w:r>
+        <w:rPr>
+          <w:sz w:val="22"/>
+          <w:szCs w:val="22"/>
+        </w:rPr>
+        <w:t xml:space="preserve"> about how </w:t>
+      </w:r>
+      <w:proofErr w:type="gramStart"/>
+      <w:r>
+        <w:rPr>
+          <w:sz w:val="22"/>
+          <w:szCs w:val="22"/>
+        </w:rPr>
+        <w:t>much</w:t>
+      </w:r>
+      <w:proofErr w:type="gramEnd"/>
+      <w:r>
+        <w:rPr>
+          <w:sz w:val="22"/>
+          <w:szCs w:val="22"/>
+        </w:rPr>
+        <w:t xml:space="preserve"> we need to have a complete </w:t>
+      </w:r>
+      <w:r>
+        <w:rPr>
+          <w:sz w:val="22"/>
+          <w:szCs w:val="22"/>
+        </w:rPr>
+        <w:t>SRS.</w:t>
       </w:r>
     </w:p>
     <w:p>

</xml_diff>